<commit_message>
upload Word for shelach
</commit_message>
<xml_diff>
--- a/public/data/bulletins/5786/shelach.docx
+++ b/public/data/bulletins/5786/shelach.docx
@@ -28,7 +28,21 @@
           <w:rFonts w:hint="cs"/>
           <w:rtl/>
         </w:rPr>
-        <w:t>השבוע נקרא בתורה את פרשת שלח. הסיפור הראשון בפרשה הוא על המרגלים שנשלחו על ידי משה רבינו לרגל את ארץ ישראל טרם כניסתנו. לאחר שהמרגלים חזרו, הם סיפרו לעם דברים לא טובים על ארץ ישראל, וכך שכנעו את העם שלא כדאי להיכנס לארץ. במאמר השבוע נעסוק בכיוון מעניין הנלמד מהסיפור, ונלמד ממנו לחיינו אנו.</w:t>
+        <w:t>השבוע נקרא בתורה את פרשת שלח. הסיפור הראשון בפרשה הוא על המרגלים שנשלחו על ידי משה רבינו לרגל את ארץ ישראל טרם כניסתנו. לאחר שהמרגלים חזרו, הם סיפרו לעם דברים לא טובים על ארץ ישראל, וכך שכנעו את העם שלא כדאי להיכנס לארץ. במאמר השבוע נעסוק ב</w:t>
+      </w:r>
+      <w:r>
+        <w:rPr>
+          <w:rFonts w:hint="cs"/>
+          <w:rtl/>
+        </w:rPr>
+        <w:t>רעיון</w:t>
+      </w:r>
+      <w:r>
+        <w:rPr>
+          <w:rFonts w:hint="cs"/>
+          <w:rtl/>
+        </w:rPr>
+        <w:t xml:space="preserve"> מעניין הנלמד מהסיפור, ונלמד ממנו לחיינו אנו.</w:t>
       </w:r>
     </w:p>
     <w:p>
@@ -400,7 +414,49 @@
           <w:rFonts w:hint="cs"/>
           <w:rtl/>
         </w:rPr>
-        <w:t>. האישה, חוה, מביטה על העץ ולא מתאפקת. היא אוכלת מהעץ, ונותנת גם לאדם.</w:t>
+        <w:t>. האישה, חוה, מביטה על העץ</w:t>
+      </w:r>
+      <w:r>
+        <w:rPr>
+          <w:rFonts w:hint="cs"/>
+          <w:rtl/>
+        </w:rPr>
+        <w:t>, הוא נראה לה טוב מאוד,</w:t>
+      </w:r>
+      <w:r>
+        <w:rPr>
+          <w:rFonts w:hint="cs"/>
+          <w:rtl/>
+        </w:rPr>
+        <w:t xml:space="preserve"> ו</w:t>
+      </w:r>
+      <w:r>
+        <w:rPr>
+          <w:rFonts w:hint="cs"/>
+          <w:rtl/>
+        </w:rPr>
+        <w:t xml:space="preserve">היא </w:t>
+      </w:r>
+      <w:r>
+        <w:rPr>
+          <w:rFonts w:hint="cs"/>
+          <w:rtl/>
+        </w:rPr>
+        <w:t>לא מתאפקת. היא אוכלת מהעץ, ונותנת גם לאדם</w:t>
+      </w:r>
+      <w:r>
+        <w:rPr>
+          <w:rFonts w:hint="cs"/>
+          <w:rtl/>
+        </w:rPr>
+        <w:t>, בעלה</w:t>
+      </w:r>
+      <w:r>
+        <w:rPr>
+          <w:rFonts w:hint="cs"/>
+          <w:rtl/>
+        </w:rPr>
+        <w:t>.</w:t>
       </w:r>
     </w:p>
     <w:p>
@@ -428,7 +484,21 @@
           <w:rFonts w:hint="cs"/>
           <w:rtl/>
         </w:rPr>
-        <w:t xml:space="preserve"> ונכנס בכוחו למקום לא טוב, והכניסה העצמאית הזו היא המאפשרת לרע לשלוט בו ולגרום לו לעשות דבר לא טוב. ברגע שאדם קצת פגם בעצמו, הוא מסוגל באמת לעבור על רצון הבורא.</w:t>
+        <w:t xml:space="preserve"> </w:t>
+      </w:r>
+      <w:r>
+        <w:rPr>
+          <w:rFonts w:hint="cs"/>
+          <w:rtl/>
+        </w:rPr>
+        <w:t>להכניס את עצמו למצב</w:t>
+      </w:r>
+      <w:r>
+        <w:rPr>
+          <w:rFonts w:hint="cs"/>
+          <w:rtl/>
+        </w:rPr>
+        <w:t xml:space="preserve"> לא טוב, והכניסה העצמאית הזו היא המאפשרת לרע לשלוט בו ולגרום לו לעשות דבר לא טוב. ברגע שאדם קצת פגם בעצמו, הוא מסוגל באמת לעבור על רצון הבורא.</w:t>
       </w:r>
     </w:p>
     <w:p>
@@ -458,7 +528,21 @@
           <w:rFonts w:hint="cs"/>
           <w:rtl/>
         </w:rPr>
-        <w:t>׳ של כוחות הטומאה בעולם. כמו שקיימים בעולם כוחות של קדושה וטוב, קיימים בעולם גם כוחות רעים של טומאה. אדם הראשון היה סקרן לדעת אם יש לכוחות הרע והטומאה בעולם משהו שאין לו.</w:t>
+        <w:t xml:space="preserve">׳ של כוחות הטומאה בעולם. כמו שקיימים בעולם כוחות של קדושה וטוב, קיימים בעולם גם כוחות רעים של טומאה. אדם הראשון היה סקרן לדעת אם יש לכוחות הרע והטומאה בעולם משהו </w:t>
+      </w:r>
+      <w:r>
+        <w:rPr>
+          <w:rFonts w:hint="cs"/>
+          <w:rtl/>
+        </w:rPr>
+        <w:t>שחסר</w:t>
+      </w:r>
+      <w:r>
+        <w:rPr>
+          <w:rFonts w:hint="cs"/>
+          <w:rtl/>
+        </w:rPr>
+        <w:t xml:space="preserve"> לו.</w:t>
       </w:r>
     </w:p>
     <w:p>
@@ -800,7 +884,21 @@
           <w:rtl/>
         </w:rPr>
         <w:lastRenderedPageBreak/>
-        <w:t>מבין שלושת הסיפורים, חטא המרגלים דומה במיוחד לסיפורו של הבל. הבל הביט במקום הקדושה מתוך גאווה וגסות, וגם המרגלים נכנסו לארץ ישראל הקדושה והביטו בה בעין רעה. לכן, התיקון של חטא המרגלים הוא גם התיקון להבל, ויחד עמו מתקנים גם את שאר הפגמים.</w:t>
+        <w:t>מבין שלושת הסיפורים, חטא המרגלים דומה במיוחד לסיפורו של הבל. הבל הביט במקום הקדושה מתוך גאווה וגסות, וגם המרגלים נכנסו לארץ ישראל הקדושה והביטו בה בעין רעה. לכן, התיקון של חטא המרגלים הוא גם התיקון ל</w:t>
+      </w:r>
+      <w:r>
+        <w:rPr>
+          <w:rFonts w:ascii="PFT_Frank" w:hAnsi="PFT_Frank" w:hint="cs"/>
+          <w:rtl/>
+        </w:rPr>
+        <w:t xml:space="preserve">חטא של </w:t>
+      </w:r>
+      <w:r>
+        <w:rPr>
+          <w:rFonts w:ascii="PFT_Frank" w:hAnsi="PFT_Frank" w:hint="cs"/>
+          <w:rtl/>
+        </w:rPr>
+        <w:t>הבל, ויחד עמו מתקנים גם את שאר הפגמים.</w:t>
       </w:r>
     </w:p>
     <w:p>
@@ -1010,7 +1108,21 @@
           <w:rFonts w:ascii="PFT_Frank" w:hAnsi="PFT_Frank" w:hint="cs"/>
           <w:rtl/>
         </w:rPr>
-        <w:t>במצוות ציצית, זוכים באמת לעשות את רצון הבורא בעולם. פה בעצם טמון הכוח לתקן את כוח הראייה שלנו. בכל מצווה שאנו מקיימים אנו יוצרים קשר חי עם הבורא, וזהו הדבר הטוב ביותר שאנחנו יכולים לעשות. כאשר אנו מתחברים אל הבורא עם כוח הראייה שלנו, אנו מתקנים את הראייה.</w:t>
+        <w:t xml:space="preserve">במצוות ציצית, זוכים באמת לעשות את רצון הבורא בעולם. פה בעצם טמון הכוח לתקן את </w:t>
+      </w:r>
+      <w:r>
+        <w:rPr>
+          <w:rFonts w:ascii="PFT_Frank" w:hAnsi="PFT_Frank" w:hint="cs"/>
+          <w:rtl/>
+        </w:rPr>
+        <w:t>חוש</w:t>
+      </w:r>
+      <w:r>
+        <w:rPr>
+          <w:rFonts w:ascii="PFT_Frank" w:hAnsi="PFT_Frank" w:hint="cs"/>
+          <w:rtl/>
+        </w:rPr>
+        <w:t xml:space="preserve"> הראייה שלנו. בכל מצווה שאנו מקיימים אנו יוצרים קשר חי עם הבורא, וזהו הדבר הטוב ביותר שאנחנו יכולים לעשות. כאשר אנו מתחברים אל הבורא עם כוח הראייה שלנו, אנו מתקנים את הראייה.</w:t>
       </w:r>
     </w:p>
     <w:p>

</xml_diff>